<commit_message>
Update Client Money and Property Policy to match actual practice
Reflects that money/property support is informal (e.g. holding cash
or a wallet during an outing) rather than formal account management:
consent is typically given verbally and recorded in progress notes
rather than via a separate written consent record, and the policy
now notes we don't access PINs or bank accounts.
</commit_message>
<xml_diff>
--- a/server/templates/library/client-money-and-property-policy/template.docx
+++ b/server/templates/library/client-money-and-property-policy/template.docx
@@ -147,11 +147,6 @@
           <w:rtl w:val="0"/>
         </w:rPr>
         <w:t>In this regard, {org.name} aims to demonstrate each of the following quality indicators through the application of this Policy and the relevant systems, procedures, workflows and other strategies referred to in this Policy and the Related Documentation:</w:t>
-      </w:r>
-      <w:r>
-        <w:rPr>
-          <w:rtl w:val="0"/>
-        </w:rPr>
       </w:r>
     </w:p>
     <w:p>
@@ -1703,7 +1698,7 @@
                 <w:vertAlign w:val="baseline"/>
                 <w:rtl w:val="0"/>
               </w:rPr>
-              <w:t xml:space="preserve"> Client has provided their written consent to use the Client’s money and property and has specified the relevant purposes where </w:t>
+              <w:t xml:space="preserve"> Client has given consent (which in practice is often given verbally at the time and recorded in the Client’s progress notes) to use the Client’s money and property and has specified the relevant purposes where </w:t>
             </w:r>
             <w:r>
               <w:rPr>
@@ -1773,7 +1768,7 @@
                 <w:rFonts w:ascii="Arial" w:cs="Arial" w:eastAsia="Arial" w:hAnsi="Arial"/>
                 <w:rtl w:val="0"/>
               </w:rPr>
-              <w:t>A written</w:t>
+              <w:t>A</w:t>
             </w:r>
             <w:r>
               <w:rPr>
@@ -1789,7 +1784,7 @@
                 <w:vertAlign w:val="baseline"/>
                 <w:rtl w:val="0"/>
               </w:rPr>
-              <w:t xml:space="preserve"> record of the Client’s valuables/property is made and kept on the Client’s information file. This record must be signed by the Principal.</w:t>
+              <w:t xml:space="preserve"> record of what money or property (e.g. cash, wallet) was held is made in the Client’s progress notes for that session.</w:t>
             </w:r>
           </w:p>
         </w:tc>
@@ -2456,7 +2451,7 @@
                 <w:rFonts w:ascii="Arial" w:cs="Arial" w:eastAsia="Arial" w:hAnsi="Arial"/>
                 <w:rtl w:val="0"/>
               </w:rPr>
-              <w:t>ATM, debit and credit cards can be very useful. However, cards operated in conjunction with PINs present particular problems concerning Client security and {org.name}’s access to a Client’s money. In supporting Clients, Workers must consider and weigh up Client rights and freedoms against security and {org.name}’s duty to the Client.</w:t>
+              <w:t>In practice, {org.name} does not access or hold Client PINs, passwords or bank account details, and Workers do not provide formal money management training under this section. ATM, debit and credit cards can be very useful. However, cards operated in conjunction with PINs present particular problems concerning Client security and {org.name}’s access to a Client’s money. In supporting Clients, Workers must consider and weigh up Client rights and freedoms against security and {org.name}’s duty to the Client.</w:t>
             </w:r>
           </w:p>
           <w:p>
@@ -4189,11 +4184,6 @@
           <w:rtl w:val="0"/>
         </w:rPr>
         <w:t>The Board of {org.legal_name}</w:t>
-      </w:r>
-      <w:r>
-        <w:rPr>
-          <w:rtl w:val="0"/>
-        </w:rPr>
       </w:r>
     </w:p>
     <w:p>

</xml_diff>